<commit_message>
change for hierarchy typograph for the chart
</commit_message>
<xml_diff>
--- a/Project Stand Up 3/Changes made for Website.docx
+++ b/Project Stand Up 3/Changes made for Website.docx
@@ -87,12 +87,10 @@
             <w:tcW w:w="4330" w:type="dxa"/>
           </w:tcPr>
           <w:p>
-            <w:pPr>
+            <w:r>
               <w:rPr>
-                <w:rFonts w:hint="eastAsia"/>
+                <w:noProof/>
               </w:rPr>
-            </w:pPr>
-            <w:r>
               <w:drawing>
                 <wp:inline distT="0" distB="0" distL="0" distR="0" wp14:anchorId="25FE55CA" wp14:editId="292DF522">
                   <wp:extent cx="2612390" cy="1361440"/>
@@ -175,6 +173,9 @@
           </w:tcPr>
           <w:p>
             <w:r>
+              <w:rPr>
+                <w:noProof/>
+              </w:rPr>
               <w:drawing>
                 <wp:inline distT="0" distB="0" distL="0" distR="0" wp14:anchorId="1D35A47D" wp14:editId="6B504CCE">
                   <wp:extent cx="2850924" cy="1485475"/>
@@ -220,7 +221,6 @@
           <w:p>
             <w:pPr>
               <w:rPr>
-                <w:rFonts w:hint="eastAsia"/>
                 <w:b/>
                 <w:bCs/>
               </w:rPr>
@@ -229,6 +229,7 @@
               <w:rPr>
                 <w:b/>
                 <w:bCs/>
+                <w:noProof/>
               </w:rPr>
               <w:drawing>
                 <wp:inline distT="0" distB="0" distL="0" distR="0" wp14:anchorId="015BE76C" wp14:editId="3DC9D8BA">
@@ -274,17 +275,140 @@
     <w:p>
       <w:pPr>
         <w:rPr>
-          <w:rFonts w:hint="eastAsia"/>
+          <w:b/>
+          <w:bCs/>
+        </w:rPr>
+      </w:pPr>
+      <w:r>
+        <w:rPr>
+          <w:b/>
+          <w:bCs/>
+        </w:rPr>
+        <w:t>Before &amp; After</w:t>
+      </w:r>
+    </w:p>
+    <w:tbl>
+      <w:tblPr>
+        <w:tblStyle w:val="TableGrid"/>
+        <w:tblW w:w="0" w:type="auto"/>
+        <w:tblLayout w:type="fixed"/>
+        <w:tblLook w:val="04A0" w:firstRow="1" w:lastRow="0" w:firstColumn="1" w:lastColumn="0" w:noHBand="0" w:noVBand="1"/>
+      </w:tblPr>
+      <w:tblGrid>
+        <w:gridCol w:w="4686"/>
+        <w:gridCol w:w="4330"/>
+      </w:tblGrid>
+      <w:tr>
+        <w:tc>
+          <w:tcPr>
+            <w:tcW w:w="4686" w:type="dxa"/>
+          </w:tcPr>
+          <w:p>
+            <w:r>
+              <w:drawing>
+                <wp:inline distT="0" distB="0" distL="0" distR="0" wp14:anchorId="52F1BA8F" wp14:editId="6AED2B43">
+                  <wp:extent cx="2841234" cy="1471612"/>
+                  <wp:effectExtent l="0" t="0" r="0" b="0"/>
+                  <wp:docPr id="1764102516" name="Picture 1"/>
+                  <wp:cNvGraphicFramePr>
+                    <a:graphicFrameLocks xmlns:a="http://schemas.openxmlformats.org/drawingml/2006/main" noChangeAspect="1"/>
+                  </wp:cNvGraphicFramePr>
+                  <a:graphic xmlns:a="http://schemas.openxmlformats.org/drawingml/2006/main">
+                    <a:graphicData uri="http://schemas.openxmlformats.org/drawingml/2006/picture">
+                      <pic:pic xmlns:pic="http://schemas.openxmlformats.org/drawingml/2006/picture">
+                        <pic:nvPicPr>
+                          <pic:cNvPr id="1764102516" name=""/>
+                          <pic:cNvPicPr/>
+                        </pic:nvPicPr>
+                        <pic:blipFill>
+                          <a:blip r:embed="rId8"/>
+                          <a:stretch>
+                            <a:fillRect/>
+                          </a:stretch>
+                        </pic:blipFill>
+                        <pic:spPr>
+                          <a:xfrm>
+                            <a:off x="0" y="0"/>
+                            <a:ext cx="2860715" cy="1481702"/>
+                          </a:xfrm>
+                          <a:prstGeom prst="rect">
+                            <a:avLst/>
+                          </a:prstGeom>
+                        </pic:spPr>
+                      </pic:pic>
+                    </a:graphicData>
+                  </a:graphic>
+                </wp:inline>
+              </w:drawing>
+            </w:r>
+          </w:p>
+        </w:tc>
+        <w:tc>
+          <w:tcPr>
+            <w:tcW w:w="4330" w:type="dxa"/>
+          </w:tcPr>
+          <w:p>
+            <w:pPr>
+              <w:rPr>
+                <w:b/>
+                <w:bCs/>
+              </w:rPr>
+            </w:pPr>
+            <w:r>
+              <w:rPr>
+                <w:b/>
+                <w:bCs/>
+              </w:rPr>
+              <w:drawing>
+                <wp:inline distT="0" distB="0" distL="0" distR="0" wp14:anchorId="145C452A" wp14:editId="32D605C5">
+                  <wp:extent cx="2612390" cy="1351280"/>
+                  <wp:effectExtent l="0" t="0" r="0" b="1270"/>
+                  <wp:docPr id="573632072" name="Picture 1"/>
+                  <wp:cNvGraphicFramePr>
+                    <a:graphicFrameLocks xmlns:a="http://schemas.openxmlformats.org/drawingml/2006/main" noChangeAspect="1"/>
+                  </wp:cNvGraphicFramePr>
+                  <a:graphic xmlns:a="http://schemas.openxmlformats.org/drawingml/2006/main">
+                    <a:graphicData uri="http://schemas.openxmlformats.org/drawingml/2006/picture">
+                      <pic:pic xmlns:pic="http://schemas.openxmlformats.org/drawingml/2006/picture">
+                        <pic:nvPicPr>
+                          <pic:cNvPr id="573632072" name=""/>
+                          <pic:cNvPicPr/>
+                        </pic:nvPicPr>
+                        <pic:blipFill>
+                          <a:blip r:embed="rId9"/>
+                          <a:stretch>
+                            <a:fillRect/>
+                          </a:stretch>
+                        </pic:blipFill>
+                        <pic:spPr>
+                          <a:xfrm>
+                            <a:off x="0" y="0"/>
+                            <a:ext cx="2612390" cy="1351280"/>
+                          </a:xfrm>
+                          <a:prstGeom prst="rect">
+                            <a:avLst/>
+                          </a:prstGeom>
+                        </pic:spPr>
+                      </pic:pic>
+                    </a:graphicData>
+                  </a:graphic>
+                </wp:inline>
+              </w:drawing>
+            </w:r>
+          </w:p>
+        </w:tc>
+      </w:tr>
+    </w:tbl>
+    <w:p>
+      <w:pPr>
+        <w:rPr>
+          <w:b/>
+          <w:bCs/>
         </w:rPr>
       </w:pPr>
     </w:p>
-    <w:p>
-      <w:pPr>
-        <w:rPr>
-          <w:rFonts w:hint="eastAsia"/>
-        </w:rPr>
-      </w:pPr>
-    </w:p>
+    <w:p/>
+    <w:p/>
     <w:sectPr>
       <w:pgSz w:w="11906" w:h="16838"/>
       <w:pgMar w:top="1440" w:right="1440" w:bottom="1440" w:left="1440" w:header="708" w:footer="708" w:gutter="0"/>

</xml_diff>